<commit_message>
Pridaný Jozef Kaduch do príručky ako poskytovateľ DPS.
</commit_message>
<xml_diff>
--- a/docs/pdfs/prirucka.docx
+++ b/docs/pdfs/prirucka.docx
@@ -1,6 +1,6 @@
 
 <file path=word/document.xml><?xml version="1.0" encoding="utf-8"?>
-<w:document xmlns:wpc="http://schemas.microsoft.com/office/word/2010/wordprocessingCanvas" xmlns:cx="http://schemas.microsoft.com/office/drawing/2014/chartex" xmlns:cx1="http://schemas.microsoft.com/office/drawing/2015/9/8/chartex" xmlns:cx2="http://schemas.microsoft.com/office/drawing/2015/10/21/chartex" xmlns:cx3="http://schemas.microsoft.com/office/drawing/2016/5/9/chartex" xmlns:cx4="http://schemas.microsoft.com/office/drawing/2016/5/10/chartex" xmlns:cx5="http://schemas.microsoft.com/office/drawing/2016/5/11/chartex" xmlns:cx6="http://schemas.microsoft.com/office/drawing/2016/5/12/chartex" xmlns:cx7="http://schemas.microsoft.com/office/drawing/2016/5/13/chartex" xmlns:cx8="http://schemas.microsoft.com/office/drawing/2016/5/14/chartex" xmlns:mc="http://schemas.openxmlformats.org/markup-compatibility/2006" xmlns:aink="http://schemas.microsoft.com/office/drawing/2016/ink" xmlns:am3d="http://schemas.microsoft.com/office/drawing/2017/model3d" xmlns:o="urn:schemas-microsoft-com:office:office" xmlns:oel="http://schemas.microsoft.com/office/2019/extlst" xmlns:r="http://schemas.openxmlformats.org/officeDocument/2006/relationships" xmlns:m="http://schemas.openxmlformats.org/officeDocument/2006/math" xmlns:v="urn:schemas-microsoft-com:vml" xmlns:wp14="http://schemas.microsoft.com/office/word/2010/wordprocessingDrawing" xmlns:wp="http://schemas.openxmlformats.org/drawingml/2006/wordprocessingDrawing" xmlns:w10="urn:schemas-microsoft-com:office:word" xmlns:w="http://schemas.openxmlformats.org/wordprocessingml/2006/main" xmlns:w14="http://schemas.microsoft.com/office/word/2010/wordml" xmlns:w15="http://schemas.microsoft.com/office/word/2012/wordml" xmlns:w16cex="http://schemas.microsoft.com/office/word/2018/wordml/cex" xmlns:w16cid="http://schemas.microsoft.com/office/word/2016/wordml/cid" xmlns:w16="http://schemas.microsoft.com/office/word/2018/wordml" xmlns:w16du="http://schemas.microsoft.com/office/word/2023/wordml/word16du" xmlns:w16sdtdh="http://schemas.microsoft.com/office/word/2020/wordml/sdtdatahash" xmlns:w16sdtfl="http://schemas.microsoft.com/office/word/2024/wordml/sdtformatlock" xmlns:w16se="http://schemas.microsoft.com/office/word/2015/wordml/symex" xmlns:wpg="http://schemas.microsoft.com/office/word/2010/wordprocessingGroup" xmlns:wpi="http://schemas.microsoft.com/office/word/2010/wordprocessingInk" xmlns:wne="http://schemas.microsoft.com/office/word/2006/wordml" xmlns:wps="http://schemas.microsoft.com/office/word/2010/wordprocessingShape" mc:Ignorable="w14 w15 w16se w16cid w16 w16cex w16sdtdh w16sdtfl w16du wp14">
+<w:document xmlns:wpc="http://schemas.microsoft.com/office/word/2010/wordprocessingCanvas" xmlns:cx="http://schemas.microsoft.com/office/drawing/2014/chartex" xmlns:cx1="http://schemas.microsoft.com/office/drawing/2015/9/8/chartex" xmlns:cx2="http://schemas.microsoft.com/office/drawing/2015/10/21/chartex" xmlns:cx3="http://schemas.microsoft.com/office/drawing/2016/5/9/chartex" xmlns:cx4="http://schemas.microsoft.com/office/drawing/2016/5/10/chartex" xmlns:cx5="http://schemas.microsoft.com/office/drawing/2016/5/11/chartex" xmlns:cx6="http://schemas.microsoft.com/office/drawing/2016/5/12/chartex" xmlns:cx7="http://schemas.microsoft.com/office/drawing/2016/5/13/chartex" xmlns:cx8="http://schemas.microsoft.com/office/drawing/2016/5/14/chartex" xmlns:mc="http://schemas.openxmlformats.org/markup-compatibility/2006" xmlns:aink="http://schemas.microsoft.com/office/drawing/2016/ink" xmlns:am3d="http://schemas.microsoft.com/office/drawing/2017/model3d" xmlns:o="urn:schemas-microsoft-com:office:office" xmlns:oel="http://schemas.microsoft.com/office/2019/extlst" xmlns:r="http://schemas.openxmlformats.org/officeDocument/2006/relationships" xmlns:m="http://schemas.openxmlformats.org/officeDocument/2006/math" xmlns:v="urn:schemas-microsoft-com:vml" xmlns:wp14="http://schemas.microsoft.com/office/word/2010/wordprocessingDrawing" xmlns:wp="http://schemas.openxmlformats.org/drawingml/2006/wordprocessingDrawing" xmlns:w10="urn:schemas-microsoft-com:office:word" xmlns:w="http://schemas.openxmlformats.org/wordprocessingml/2006/main" xmlns:w14="http://schemas.microsoft.com/office/word/2010/wordml" xmlns:w15="http://schemas.microsoft.com/office/word/2012/wordml" xmlns:w16cei="http://schemas.microsoft.com/office/word/2026/wordml/cei" xmlns:w16cex="http://schemas.microsoft.com/office/word/2018/wordml/cex" xmlns:w16cid="http://schemas.microsoft.com/office/word/2016/wordml/cid" xmlns:w16="http://schemas.microsoft.com/office/word/2018/wordml" xmlns:w16du="http://schemas.microsoft.com/office/word/2023/wordml/word16du" xmlns:w16sdtdh="http://schemas.microsoft.com/office/word/2020/wordml/sdtdatahash" xmlns:w16sdtfl="http://schemas.microsoft.com/office/word/2024/wordml/sdtformatlock" xmlns:w16se="http://schemas.microsoft.com/office/word/2015/wordml/symex" xmlns:wpg="http://schemas.microsoft.com/office/word/2010/wordprocessingGroup" xmlns:wpi="http://schemas.microsoft.com/office/word/2010/wordprocessingInk" xmlns:wne="http://schemas.microsoft.com/office/word/2006/wordml" xmlns:wps="http://schemas.microsoft.com/office/word/2010/wordprocessingShape" mc:Ignorable="w14 w15 w16se w16cid w16 w16cex w16sdtdh w16sdtfl w16du wp14">
   <w:background w:color="FFFFFF" w:themeColor="background1"/>
   <w:body>
     <w:p>
@@ -15755,6 +15755,65 @@
                 <w:b/>
                 <w:bCs/>
               </w:rPr>
+              <w:t xml:space="preserve">Doska plošného spoja (DPS): </w:t>
+            </w:r>
+          </w:p>
+        </w:tc>
+        <w:tc>
+          <w:tcPr>
+            <w:tcW w:w="3260" w:type="dxa"/>
+          </w:tcPr>
+          <w:p>
+            <w:pPr>
+              <w:jc w:val="left"/>
+              <w:rPr>
+                <w:rFonts w:cs="Courier New"/>
+              </w:rPr>
+            </w:pPr>
+            <w:r>
+              <w:rPr>
+                <w:rFonts w:cs="Courier New"/>
+              </w:rPr>
+              <w:t xml:space="preserve">Bc. Jozef </w:t>
+            </w:r>
+            <w:proofErr w:type="spellStart"/>
+            <w:r>
+              <w:rPr>
+                <w:rFonts w:cs="Courier New"/>
+              </w:rPr>
+              <w:t>Kaduch</w:t>
+            </w:r>
+            <w:proofErr w:type="spellEnd"/>
+          </w:p>
+          <w:p>
+            <w:pPr>
+              <w:jc w:val="left"/>
+              <w:rPr>
+                <w:rFonts w:cs="Courier New"/>
+              </w:rPr>
+            </w:pPr>
+          </w:p>
+        </w:tc>
+      </w:tr>
+      <w:tr>
+        <w:tc>
+          <w:tcPr>
+            <w:tcW w:w="4111" w:type="dxa"/>
+          </w:tcPr>
+          <w:p>
+            <w:pPr>
+              <w:rPr>
+                <w:rFonts w:cs="Courier New"/>
+                <w:b/>
+                <w:bCs/>
+              </w:rPr>
+            </w:pPr>
+            <w:r>
+              <w:rPr>
+                <w:rFonts w:cs="Courier New"/>
+                <w:b/>
+                <w:bCs/>
+              </w:rPr>
               <w:t>Chémia na leptanie DPS</w:t>
             </w:r>
             <w:r>
@@ -16486,7 +16545,7 @@
 </file>
 
 <file path=word/endnotes.xml><?xml version="1.0" encoding="utf-8"?>
-<w:endnotes xmlns:wpc="http://schemas.microsoft.com/office/word/2010/wordprocessingCanvas" xmlns:cx="http://schemas.microsoft.com/office/drawing/2014/chartex" xmlns:cx1="http://schemas.microsoft.com/office/drawing/2015/9/8/chartex" xmlns:cx2="http://schemas.microsoft.com/office/drawing/2015/10/21/chartex" xmlns:cx3="http://schemas.microsoft.com/office/drawing/2016/5/9/chartex" xmlns:cx4="http://schemas.microsoft.com/office/drawing/2016/5/10/chartex" xmlns:cx5="http://schemas.microsoft.com/office/drawing/2016/5/11/chartex" xmlns:cx6="http://schemas.microsoft.com/office/drawing/2016/5/12/chartex" xmlns:cx7="http://schemas.microsoft.com/office/drawing/2016/5/13/chartex" xmlns:cx8="http://schemas.microsoft.com/office/drawing/2016/5/14/chartex" xmlns:mc="http://schemas.openxmlformats.org/markup-compatibility/2006" xmlns:aink="http://schemas.microsoft.com/office/drawing/2016/ink" xmlns:am3d="http://schemas.microsoft.com/office/drawing/2017/model3d" xmlns:o="urn:schemas-microsoft-com:office:office" xmlns:oel="http://schemas.microsoft.com/office/2019/extlst" xmlns:r="http://schemas.openxmlformats.org/officeDocument/2006/relationships" xmlns:m="http://schemas.openxmlformats.org/officeDocument/2006/math" xmlns:v="urn:schemas-microsoft-com:vml" xmlns:wp14="http://schemas.microsoft.com/office/word/2010/wordprocessingDrawing" xmlns:wp="http://schemas.openxmlformats.org/drawingml/2006/wordprocessingDrawing" xmlns:w10="urn:schemas-microsoft-com:office:word" xmlns:w="http://schemas.openxmlformats.org/wordprocessingml/2006/main" xmlns:w14="http://schemas.microsoft.com/office/word/2010/wordml" xmlns:w15="http://schemas.microsoft.com/office/word/2012/wordml" xmlns:w16cex="http://schemas.microsoft.com/office/word/2018/wordml/cex" xmlns:w16cid="http://schemas.microsoft.com/office/word/2016/wordml/cid" xmlns:w16="http://schemas.microsoft.com/office/word/2018/wordml" xmlns:w16du="http://schemas.microsoft.com/office/word/2023/wordml/word16du" xmlns:w16sdtdh="http://schemas.microsoft.com/office/word/2020/wordml/sdtdatahash" xmlns:w16sdtfl="http://schemas.microsoft.com/office/word/2024/wordml/sdtformatlock" xmlns:w16se="http://schemas.microsoft.com/office/word/2015/wordml/symex" xmlns:wpg="http://schemas.microsoft.com/office/word/2010/wordprocessingGroup" xmlns:wpi="http://schemas.microsoft.com/office/word/2010/wordprocessingInk" xmlns:wne="http://schemas.microsoft.com/office/word/2006/wordml" xmlns:wps="http://schemas.microsoft.com/office/word/2010/wordprocessingShape" mc:Ignorable="w14 w15 w16se w16cid w16 w16cex w16sdtdh w16sdtfl w16du wp14">
+<w:endnotes xmlns:wpc="http://schemas.microsoft.com/office/word/2010/wordprocessingCanvas" xmlns:cx="http://schemas.microsoft.com/office/drawing/2014/chartex" xmlns:cx1="http://schemas.microsoft.com/office/drawing/2015/9/8/chartex" xmlns:cx2="http://schemas.microsoft.com/office/drawing/2015/10/21/chartex" xmlns:cx3="http://schemas.microsoft.com/office/drawing/2016/5/9/chartex" xmlns:cx4="http://schemas.microsoft.com/office/drawing/2016/5/10/chartex" xmlns:cx5="http://schemas.microsoft.com/office/drawing/2016/5/11/chartex" xmlns:cx6="http://schemas.microsoft.com/office/drawing/2016/5/12/chartex" xmlns:cx7="http://schemas.microsoft.com/office/drawing/2016/5/13/chartex" xmlns:cx8="http://schemas.microsoft.com/office/drawing/2016/5/14/chartex" xmlns:mc="http://schemas.openxmlformats.org/markup-compatibility/2006" xmlns:aink="http://schemas.microsoft.com/office/drawing/2016/ink" xmlns:am3d="http://schemas.microsoft.com/office/drawing/2017/model3d" xmlns:o="urn:schemas-microsoft-com:office:office" xmlns:oel="http://schemas.microsoft.com/office/2019/extlst" xmlns:r="http://schemas.openxmlformats.org/officeDocument/2006/relationships" xmlns:m="http://schemas.openxmlformats.org/officeDocument/2006/math" xmlns:v="urn:schemas-microsoft-com:vml" xmlns:wp14="http://schemas.microsoft.com/office/word/2010/wordprocessingDrawing" xmlns:wp="http://schemas.openxmlformats.org/drawingml/2006/wordprocessingDrawing" xmlns:w10="urn:schemas-microsoft-com:office:word" xmlns:w="http://schemas.openxmlformats.org/wordprocessingml/2006/main" xmlns:w14="http://schemas.microsoft.com/office/word/2010/wordml" xmlns:w15="http://schemas.microsoft.com/office/word/2012/wordml" xmlns:w16cei="http://schemas.microsoft.com/office/word/2026/wordml/cei" xmlns:w16cex="http://schemas.microsoft.com/office/word/2018/wordml/cex" xmlns:w16cid="http://schemas.microsoft.com/office/word/2016/wordml/cid" xmlns:w16="http://schemas.microsoft.com/office/word/2018/wordml" xmlns:w16du="http://schemas.microsoft.com/office/word/2023/wordml/word16du" xmlns:w16sdtdh="http://schemas.microsoft.com/office/word/2020/wordml/sdtdatahash" xmlns:w16sdtfl="http://schemas.microsoft.com/office/word/2024/wordml/sdtformatlock" xmlns:w16se="http://schemas.microsoft.com/office/word/2015/wordml/symex" xmlns:wpg="http://schemas.microsoft.com/office/word/2010/wordprocessingGroup" xmlns:wpi="http://schemas.microsoft.com/office/word/2010/wordprocessingInk" xmlns:wne="http://schemas.microsoft.com/office/word/2006/wordml" xmlns:wps="http://schemas.microsoft.com/office/word/2010/wordprocessingShape" mc:Ignorable="w14 w15 w16se w16cid w16 w16cex w16sdtdh w16sdtfl w16du wp14">
   <w:endnote w:type="separator" w:id="-1">
     <w:p>
       <w:pPr>
@@ -16511,7 +16570,7 @@
 </file>
 
 <file path=word/footer1.xml><?xml version="1.0" encoding="utf-8"?>
-<w:ftr xmlns:wpc="http://schemas.microsoft.com/office/word/2010/wordprocessingCanvas" xmlns:cx="http://schemas.microsoft.com/office/drawing/2014/chartex" xmlns:cx1="http://schemas.microsoft.com/office/drawing/2015/9/8/chartex" xmlns:cx2="http://schemas.microsoft.com/office/drawing/2015/10/21/chartex" xmlns:cx3="http://schemas.microsoft.com/office/drawing/2016/5/9/chartex" xmlns:cx4="http://schemas.microsoft.com/office/drawing/2016/5/10/chartex" xmlns:cx5="http://schemas.microsoft.com/office/drawing/2016/5/11/chartex" xmlns:cx6="http://schemas.microsoft.com/office/drawing/2016/5/12/chartex" xmlns:cx7="http://schemas.microsoft.com/office/drawing/2016/5/13/chartex" xmlns:cx8="http://schemas.microsoft.com/office/drawing/2016/5/14/chartex" xmlns:mc="http://schemas.openxmlformats.org/markup-compatibility/2006" xmlns:aink="http://schemas.microsoft.com/office/drawing/2016/ink" xmlns:am3d="http://schemas.microsoft.com/office/drawing/2017/model3d" xmlns:o="urn:schemas-microsoft-com:office:office" xmlns:oel="http://schemas.microsoft.com/office/2019/extlst" xmlns:r="http://schemas.openxmlformats.org/officeDocument/2006/relationships" xmlns:m="http://schemas.openxmlformats.org/officeDocument/2006/math" xmlns:v="urn:schemas-microsoft-com:vml" xmlns:wp14="http://schemas.microsoft.com/office/word/2010/wordprocessingDrawing" xmlns:wp="http://schemas.openxmlformats.org/drawingml/2006/wordprocessingDrawing" xmlns:w10="urn:schemas-microsoft-com:office:word" xmlns:w="http://schemas.openxmlformats.org/wordprocessingml/2006/main" xmlns:w14="http://schemas.microsoft.com/office/word/2010/wordml" xmlns:w15="http://schemas.microsoft.com/office/word/2012/wordml" xmlns:w16cex="http://schemas.microsoft.com/office/word/2018/wordml/cex" xmlns:w16cid="http://schemas.microsoft.com/office/word/2016/wordml/cid" xmlns:w16="http://schemas.microsoft.com/office/word/2018/wordml" xmlns:w16du="http://schemas.microsoft.com/office/word/2023/wordml/word16du" xmlns:w16sdtdh="http://schemas.microsoft.com/office/word/2020/wordml/sdtdatahash" xmlns:w16sdtfl="http://schemas.microsoft.com/office/word/2024/wordml/sdtformatlock" xmlns:w16se="http://schemas.microsoft.com/office/word/2015/wordml/symex" xmlns:wpg="http://schemas.microsoft.com/office/word/2010/wordprocessingGroup" xmlns:wpi="http://schemas.microsoft.com/office/word/2010/wordprocessingInk" xmlns:wne="http://schemas.microsoft.com/office/word/2006/wordml" xmlns:wps="http://schemas.microsoft.com/office/word/2010/wordprocessingShape" mc:Ignorable="w14 w15 w16se w16cid w16 w16cex w16sdtdh w16sdtfl w16du wp14">
+<w:ftr xmlns:wpc="http://schemas.microsoft.com/office/word/2010/wordprocessingCanvas" xmlns:cx="http://schemas.microsoft.com/office/drawing/2014/chartex" xmlns:cx1="http://schemas.microsoft.com/office/drawing/2015/9/8/chartex" xmlns:cx2="http://schemas.microsoft.com/office/drawing/2015/10/21/chartex" xmlns:cx3="http://schemas.microsoft.com/office/drawing/2016/5/9/chartex" xmlns:cx4="http://schemas.microsoft.com/office/drawing/2016/5/10/chartex" xmlns:cx5="http://schemas.microsoft.com/office/drawing/2016/5/11/chartex" xmlns:cx6="http://schemas.microsoft.com/office/drawing/2016/5/12/chartex" xmlns:cx7="http://schemas.microsoft.com/office/drawing/2016/5/13/chartex" xmlns:cx8="http://schemas.microsoft.com/office/drawing/2016/5/14/chartex" xmlns:mc="http://schemas.openxmlformats.org/markup-compatibility/2006" xmlns:aink="http://schemas.microsoft.com/office/drawing/2016/ink" xmlns:am3d="http://schemas.microsoft.com/office/drawing/2017/model3d" xmlns:o="urn:schemas-microsoft-com:office:office" xmlns:oel="http://schemas.microsoft.com/office/2019/extlst" xmlns:r="http://schemas.openxmlformats.org/officeDocument/2006/relationships" xmlns:m="http://schemas.openxmlformats.org/officeDocument/2006/math" xmlns:v="urn:schemas-microsoft-com:vml" xmlns:wp14="http://schemas.microsoft.com/office/word/2010/wordprocessingDrawing" xmlns:wp="http://schemas.openxmlformats.org/drawingml/2006/wordprocessingDrawing" xmlns:w10="urn:schemas-microsoft-com:office:word" xmlns:w="http://schemas.openxmlformats.org/wordprocessingml/2006/main" xmlns:w14="http://schemas.microsoft.com/office/word/2010/wordml" xmlns:w15="http://schemas.microsoft.com/office/word/2012/wordml" xmlns:w16cei="http://schemas.microsoft.com/office/word/2026/wordml/cei" xmlns:w16cex="http://schemas.microsoft.com/office/word/2018/wordml/cex" xmlns:w16cid="http://schemas.microsoft.com/office/word/2016/wordml/cid" xmlns:w16="http://schemas.microsoft.com/office/word/2018/wordml" xmlns:w16du="http://schemas.microsoft.com/office/word/2023/wordml/word16du" xmlns:w16sdtdh="http://schemas.microsoft.com/office/word/2020/wordml/sdtdatahash" xmlns:w16sdtfl="http://schemas.microsoft.com/office/word/2024/wordml/sdtformatlock" xmlns:w16se="http://schemas.microsoft.com/office/word/2015/wordml/symex" xmlns:wpg="http://schemas.microsoft.com/office/word/2010/wordprocessingGroup" xmlns:wpi="http://schemas.microsoft.com/office/word/2010/wordprocessingInk" xmlns:wne="http://schemas.microsoft.com/office/word/2006/wordml" xmlns:wps="http://schemas.microsoft.com/office/word/2010/wordprocessingShape" mc:Ignorable="w14 w15 w16se w16cid w16 w16cex w16sdtdh w16sdtfl w16du wp14">
   <w:sdt>
     <w:sdtPr>
       <w:id w:val="-54392908"/>
@@ -16584,7 +16643,7 @@
 </file>
 
 <file path=word/footer2.xml><?xml version="1.0" encoding="utf-8"?>
-<w:ftr xmlns:wpc="http://schemas.microsoft.com/office/word/2010/wordprocessingCanvas" xmlns:cx="http://schemas.microsoft.com/office/drawing/2014/chartex" xmlns:cx1="http://schemas.microsoft.com/office/drawing/2015/9/8/chartex" xmlns:cx2="http://schemas.microsoft.com/office/drawing/2015/10/21/chartex" xmlns:cx3="http://schemas.microsoft.com/office/drawing/2016/5/9/chartex" xmlns:cx4="http://schemas.microsoft.com/office/drawing/2016/5/10/chartex" xmlns:cx5="http://schemas.microsoft.com/office/drawing/2016/5/11/chartex" xmlns:cx6="http://schemas.microsoft.com/office/drawing/2016/5/12/chartex" xmlns:cx7="http://schemas.microsoft.com/office/drawing/2016/5/13/chartex" xmlns:cx8="http://schemas.microsoft.com/office/drawing/2016/5/14/chartex" xmlns:mc="http://schemas.openxmlformats.org/markup-compatibility/2006" xmlns:aink="http://schemas.microsoft.com/office/drawing/2016/ink" xmlns:am3d="http://schemas.microsoft.com/office/drawing/2017/model3d" xmlns:o="urn:schemas-microsoft-com:office:office" xmlns:oel="http://schemas.microsoft.com/office/2019/extlst" xmlns:r="http://schemas.openxmlformats.org/officeDocument/2006/relationships" xmlns:m="http://schemas.openxmlformats.org/officeDocument/2006/math" xmlns:v="urn:schemas-microsoft-com:vml" xmlns:wp14="http://schemas.microsoft.com/office/word/2010/wordprocessingDrawing" xmlns:wp="http://schemas.openxmlformats.org/drawingml/2006/wordprocessingDrawing" xmlns:w10="urn:schemas-microsoft-com:office:word" xmlns:w="http://schemas.openxmlformats.org/wordprocessingml/2006/main" xmlns:w14="http://schemas.microsoft.com/office/word/2010/wordml" xmlns:w15="http://schemas.microsoft.com/office/word/2012/wordml" xmlns:w16cex="http://schemas.microsoft.com/office/word/2018/wordml/cex" xmlns:w16cid="http://schemas.microsoft.com/office/word/2016/wordml/cid" xmlns:w16="http://schemas.microsoft.com/office/word/2018/wordml" xmlns:w16du="http://schemas.microsoft.com/office/word/2023/wordml/word16du" xmlns:w16sdtdh="http://schemas.microsoft.com/office/word/2020/wordml/sdtdatahash" xmlns:w16sdtfl="http://schemas.microsoft.com/office/word/2024/wordml/sdtformatlock" xmlns:w16se="http://schemas.microsoft.com/office/word/2015/wordml/symex" xmlns:wpg="http://schemas.microsoft.com/office/word/2010/wordprocessingGroup" xmlns:wpi="http://schemas.microsoft.com/office/word/2010/wordprocessingInk" xmlns:wne="http://schemas.microsoft.com/office/word/2006/wordml" xmlns:wps="http://schemas.microsoft.com/office/word/2010/wordprocessingShape" mc:Ignorable="w14 w15 w16se w16cid w16 w16cex w16sdtdh w16sdtfl w16du wp14">
+<w:ftr xmlns:wpc="http://schemas.microsoft.com/office/word/2010/wordprocessingCanvas" xmlns:cx="http://schemas.microsoft.com/office/drawing/2014/chartex" xmlns:cx1="http://schemas.microsoft.com/office/drawing/2015/9/8/chartex" xmlns:cx2="http://schemas.microsoft.com/office/drawing/2015/10/21/chartex" xmlns:cx3="http://schemas.microsoft.com/office/drawing/2016/5/9/chartex" xmlns:cx4="http://schemas.microsoft.com/office/drawing/2016/5/10/chartex" xmlns:cx5="http://schemas.microsoft.com/office/drawing/2016/5/11/chartex" xmlns:cx6="http://schemas.microsoft.com/office/drawing/2016/5/12/chartex" xmlns:cx7="http://schemas.microsoft.com/office/drawing/2016/5/13/chartex" xmlns:cx8="http://schemas.microsoft.com/office/drawing/2016/5/14/chartex" xmlns:mc="http://schemas.openxmlformats.org/markup-compatibility/2006" xmlns:aink="http://schemas.microsoft.com/office/drawing/2016/ink" xmlns:am3d="http://schemas.microsoft.com/office/drawing/2017/model3d" xmlns:o="urn:schemas-microsoft-com:office:office" xmlns:oel="http://schemas.microsoft.com/office/2019/extlst" xmlns:r="http://schemas.openxmlformats.org/officeDocument/2006/relationships" xmlns:m="http://schemas.openxmlformats.org/officeDocument/2006/math" xmlns:v="urn:schemas-microsoft-com:vml" xmlns:wp14="http://schemas.microsoft.com/office/word/2010/wordprocessingDrawing" xmlns:wp="http://schemas.openxmlformats.org/drawingml/2006/wordprocessingDrawing" xmlns:w10="urn:schemas-microsoft-com:office:word" xmlns:w="http://schemas.openxmlformats.org/wordprocessingml/2006/main" xmlns:w14="http://schemas.microsoft.com/office/word/2010/wordml" xmlns:w15="http://schemas.microsoft.com/office/word/2012/wordml" xmlns:w16cei="http://schemas.microsoft.com/office/word/2026/wordml/cei" xmlns:w16cex="http://schemas.microsoft.com/office/word/2018/wordml/cex" xmlns:w16cid="http://schemas.microsoft.com/office/word/2016/wordml/cid" xmlns:w16="http://schemas.microsoft.com/office/word/2018/wordml" xmlns:w16du="http://schemas.microsoft.com/office/word/2023/wordml/word16du" xmlns:w16sdtdh="http://schemas.microsoft.com/office/word/2020/wordml/sdtdatahash" xmlns:w16sdtfl="http://schemas.microsoft.com/office/word/2024/wordml/sdtformatlock" xmlns:w16se="http://schemas.microsoft.com/office/word/2015/wordml/symex" xmlns:wpg="http://schemas.microsoft.com/office/word/2010/wordprocessingGroup" xmlns:wpi="http://schemas.microsoft.com/office/word/2010/wordprocessingInk" xmlns:wne="http://schemas.microsoft.com/office/word/2006/wordml" xmlns:wps="http://schemas.microsoft.com/office/word/2010/wordprocessingShape" mc:Ignorable="w14 w15 w16se w16cid w16 w16cex w16sdtdh w16sdtfl w16du wp14">
   <w:p>
     <w:pPr>
       <w:pStyle w:val="Zpat"/>
@@ -16604,7 +16663,7 @@
 </file>
 
 <file path=word/footer3.xml><?xml version="1.0" encoding="utf-8"?>
-<w:ftr xmlns:wpc="http://schemas.microsoft.com/office/word/2010/wordprocessingCanvas" xmlns:cx="http://schemas.microsoft.com/office/drawing/2014/chartex" xmlns:cx1="http://schemas.microsoft.com/office/drawing/2015/9/8/chartex" xmlns:cx2="http://schemas.microsoft.com/office/drawing/2015/10/21/chartex" xmlns:cx3="http://schemas.microsoft.com/office/drawing/2016/5/9/chartex" xmlns:cx4="http://schemas.microsoft.com/office/drawing/2016/5/10/chartex" xmlns:cx5="http://schemas.microsoft.com/office/drawing/2016/5/11/chartex" xmlns:cx6="http://schemas.microsoft.com/office/drawing/2016/5/12/chartex" xmlns:cx7="http://schemas.microsoft.com/office/drawing/2016/5/13/chartex" xmlns:cx8="http://schemas.microsoft.com/office/drawing/2016/5/14/chartex" xmlns:mc="http://schemas.openxmlformats.org/markup-compatibility/2006" xmlns:aink="http://schemas.microsoft.com/office/drawing/2016/ink" xmlns:am3d="http://schemas.microsoft.com/office/drawing/2017/model3d" xmlns:o="urn:schemas-microsoft-com:office:office" xmlns:oel="http://schemas.microsoft.com/office/2019/extlst" xmlns:r="http://schemas.openxmlformats.org/officeDocument/2006/relationships" xmlns:m="http://schemas.openxmlformats.org/officeDocument/2006/math" xmlns:v="urn:schemas-microsoft-com:vml" xmlns:wp14="http://schemas.microsoft.com/office/word/2010/wordprocessingDrawing" xmlns:wp="http://schemas.openxmlformats.org/drawingml/2006/wordprocessingDrawing" xmlns:w10="urn:schemas-microsoft-com:office:word" xmlns:w="http://schemas.openxmlformats.org/wordprocessingml/2006/main" xmlns:w14="http://schemas.microsoft.com/office/word/2010/wordml" xmlns:w15="http://schemas.microsoft.com/office/word/2012/wordml" xmlns:w16cex="http://schemas.microsoft.com/office/word/2018/wordml/cex" xmlns:w16cid="http://schemas.microsoft.com/office/word/2016/wordml/cid" xmlns:w16="http://schemas.microsoft.com/office/word/2018/wordml" xmlns:w16du="http://schemas.microsoft.com/office/word/2023/wordml/word16du" xmlns:w16sdtdh="http://schemas.microsoft.com/office/word/2020/wordml/sdtdatahash" xmlns:w16sdtfl="http://schemas.microsoft.com/office/word/2024/wordml/sdtformatlock" xmlns:w16se="http://schemas.microsoft.com/office/word/2015/wordml/symex" xmlns:wpg="http://schemas.microsoft.com/office/word/2010/wordprocessingGroup" xmlns:wpi="http://schemas.microsoft.com/office/word/2010/wordprocessingInk" xmlns:wne="http://schemas.microsoft.com/office/word/2006/wordml" xmlns:wps="http://schemas.microsoft.com/office/word/2010/wordprocessingShape" mc:Ignorable="w14 w15 w16se w16cid w16 w16cex w16sdtdh w16sdtfl w16du wp14">
+<w:ftr xmlns:wpc="http://schemas.microsoft.com/office/word/2010/wordprocessingCanvas" xmlns:cx="http://schemas.microsoft.com/office/drawing/2014/chartex" xmlns:cx1="http://schemas.microsoft.com/office/drawing/2015/9/8/chartex" xmlns:cx2="http://schemas.microsoft.com/office/drawing/2015/10/21/chartex" xmlns:cx3="http://schemas.microsoft.com/office/drawing/2016/5/9/chartex" xmlns:cx4="http://schemas.microsoft.com/office/drawing/2016/5/10/chartex" xmlns:cx5="http://schemas.microsoft.com/office/drawing/2016/5/11/chartex" xmlns:cx6="http://schemas.microsoft.com/office/drawing/2016/5/12/chartex" xmlns:cx7="http://schemas.microsoft.com/office/drawing/2016/5/13/chartex" xmlns:cx8="http://schemas.microsoft.com/office/drawing/2016/5/14/chartex" xmlns:mc="http://schemas.openxmlformats.org/markup-compatibility/2006" xmlns:aink="http://schemas.microsoft.com/office/drawing/2016/ink" xmlns:am3d="http://schemas.microsoft.com/office/drawing/2017/model3d" xmlns:o="urn:schemas-microsoft-com:office:office" xmlns:oel="http://schemas.microsoft.com/office/2019/extlst" xmlns:r="http://schemas.openxmlformats.org/officeDocument/2006/relationships" xmlns:m="http://schemas.openxmlformats.org/officeDocument/2006/math" xmlns:v="urn:schemas-microsoft-com:vml" xmlns:wp14="http://schemas.microsoft.com/office/word/2010/wordprocessingDrawing" xmlns:wp="http://schemas.openxmlformats.org/drawingml/2006/wordprocessingDrawing" xmlns:w10="urn:schemas-microsoft-com:office:word" xmlns:w="http://schemas.openxmlformats.org/wordprocessingml/2006/main" xmlns:w14="http://schemas.microsoft.com/office/word/2010/wordml" xmlns:w15="http://schemas.microsoft.com/office/word/2012/wordml" xmlns:w16cei="http://schemas.microsoft.com/office/word/2026/wordml/cei" xmlns:w16cex="http://schemas.microsoft.com/office/word/2018/wordml/cex" xmlns:w16cid="http://schemas.microsoft.com/office/word/2016/wordml/cid" xmlns:w16="http://schemas.microsoft.com/office/word/2018/wordml" xmlns:w16du="http://schemas.microsoft.com/office/word/2023/wordml/word16du" xmlns:w16sdtdh="http://schemas.microsoft.com/office/word/2020/wordml/sdtdatahash" xmlns:w16sdtfl="http://schemas.microsoft.com/office/word/2024/wordml/sdtformatlock" xmlns:w16se="http://schemas.microsoft.com/office/word/2015/wordml/symex" xmlns:wpg="http://schemas.microsoft.com/office/word/2010/wordprocessingGroup" xmlns:wpi="http://schemas.microsoft.com/office/word/2010/wordprocessingInk" xmlns:wne="http://schemas.microsoft.com/office/word/2006/wordml" xmlns:wps="http://schemas.microsoft.com/office/word/2010/wordprocessingShape" mc:Ignorable="w14 w15 w16se w16cid w16 w16cex w16sdtdh w16sdtfl w16du wp14">
   <w:p>
     <w:pPr>
       <w:pStyle w:val="Zpat"/>
@@ -16624,7 +16683,7 @@
 </file>
 
 <file path=word/footer4.xml><?xml version="1.0" encoding="utf-8"?>
-<w:ftr xmlns:wpc="http://schemas.microsoft.com/office/word/2010/wordprocessingCanvas" xmlns:cx="http://schemas.microsoft.com/office/drawing/2014/chartex" xmlns:cx1="http://schemas.microsoft.com/office/drawing/2015/9/8/chartex" xmlns:cx2="http://schemas.microsoft.com/office/drawing/2015/10/21/chartex" xmlns:cx3="http://schemas.microsoft.com/office/drawing/2016/5/9/chartex" xmlns:cx4="http://schemas.microsoft.com/office/drawing/2016/5/10/chartex" xmlns:cx5="http://schemas.microsoft.com/office/drawing/2016/5/11/chartex" xmlns:cx6="http://schemas.microsoft.com/office/drawing/2016/5/12/chartex" xmlns:cx7="http://schemas.microsoft.com/office/drawing/2016/5/13/chartex" xmlns:cx8="http://schemas.microsoft.com/office/drawing/2016/5/14/chartex" xmlns:mc="http://schemas.openxmlformats.org/markup-compatibility/2006" xmlns:aink="http://schemas.microsoft.com/office/drawing/2016/ink" xmlns:am3d="http://schemas.microsoft.com/office/drawing/2017/model3d" xmlns:o="urn:schemas-microsoft-com:office:office" xmlns:oel="http://schemas.microsoft.com/office/2019/extlst" xmlns:r="http://schemas.openxmlformats.org/officeDocument/2006/relationships" xmlns:m="http://schemas.openxmlformats.org/officeDocument/2006/math" xmlns:v="urn:schemas-microsoft-com:vml" xmlns:wp14="http://schemas.microsoft.com/office/word/2010/wordprocessingDrawing" xmlns:wp="http://schemas.openxmlformats.org/drawingml/2006/wordprocessingDrawing" xmlns:w10="urn:schemas-microsoft-com:office:word" xmlns:w="http://schemas.openxmlformats.org/wordprocessingml/2006/main" xmlns:w14="http://schemas.microsoft.com/office/word/2010/wordml" xmlns:w15="http://schemas.microsoft.com/office/word/2012/wordml" xmlns:w16cex="http://schemas.microsoft.com/office/word/2018/wordml/cex" xmlns:w16cid="http://schemas.microsoft.com/office/word/2016/wordml/cid" xmlns:w16="http://schemas.microsoft.com/office/word/2018/wordml" xmlns:w16du="http://schemas.microsoft.com/office/word/2023/wordml/word16du" xmlns:w16sdtdh="http://schemas.microsoft.com/office/word/2020/wordml/sdtdatahash" xmlns:w16sdtfl="http://schemas.microsoft.com/office/word/2024/wordml/sdtformatlock" xmlns:w16se="http://schemas.microsoft.com/office/word/2015/wordml/symex" xmlns:wpg="http://schemas.microsoft.com/office/word/2010/wordprocessingGroup" xmlns:wpi="http://schemas.microsoft.com/office/word/2010/wordprocessingInk" xmlns:wne="http://schemas.microsoft.com/office/word/2006/wordml" xmlns:wps="http://schemas.microsoft.com/office/word/2010/wordprocessingShape" mc:Ignorable="w14 w15 w16se w16cid w16 w16cex w16sdtdh w16sdtfl w16du wp14">
+<w:ftr xmlns:wpc="http://schemas.microsoft.com/office/word/2010/wordprocessingCanvas" xmlns:cx="http://schemas.microsoft.com/office/drawing/2014/chartex" xmlns:cx1="http://schemas.microsoft.com/office/drawing/2015/9/8/chartex" xmlns:cx2="http://schemas.microsoft.com/office/drawing/2015/10/21/chartex" xmlns:cx3="http://schemas.microsoft.com/office/drawing/2016/5/9/chartex" xmlns:cx4="http://schemas.microsoft.com/office/drawing/2016/5/10/chartex" xmlns:cx5="http://schemas.microsoft.com/office/drawing/2016/5/11/chartex" xmlns:cx6="http://schemas.microsoft.com/office/drawing/2016/5/12/chartex" xmlns:cx7="http://schemas.microsoft.com/office/drawing/2016/5/13/chartex" xmlns:cx8="http://schemas.microsoft.com/office/drawing/2016/5/14/chartex" xmlns:mc="http://schemas.openxmlformats.org/markup-compatibility/2006" xmlns:aink="http://schemas.microsoft.com/office/drawing/2016/ink" xmlns:am3d="http://schemas.microsoft.com/office/drawing/2017/model3d" xmlns:o="urn:schemas-microsoft-com:office:office" xmlns:oel="http://schemas.microsoft.com/office/2019/extlst" xmlns:r="http://schemas.openxmlformats.org/officeDocument/2006/relationships" xmlns:m="http://schemas.openxmlformats.org/officeDocument/2006/math" xmlns:v="urn:schemas-microsoft-com:vml" xmlns:wp14="http://schemas.microsoft.com/office/word/2010/wordprocessingDrawing" xmlns:wp="http://schemas.openxmlformats.org/drawingml/2006/wordprocessingDrawing" xmlns:w10="urn:schemas-microsoft-com:office:word" xmlns:w="http://schemas.openxmlformats.org/wordprocessingml/2006/main" xmlns:w14="http://schemas.microsoft.com/office/word/2010/wordml" xmlns:w15="http://schemas.microsoft.com/office/word/2012/wordml" xmlns:w16cei="http://schemas.microsoft.com/office/word/2026/wordml/cei" xmlns:w16cex="http://schemas.microsoft.com/office/word/2018/wordml/cex" xmlns:w16cid="http://schemas.microsoft.com/office/word/2016/wordml/cid" xmlns:w16="http://schemas.microsoft.com/office/word/2018/wordml" xmlns:w16du="http://schemas.microsoft.com/office/word/2023/wordml/word16du" xmlns:w16sdtdh="http://schemas.microsoft.com/office/word/2020/wordml/sdtdatahash" xmlns:w16sdtfl="http://schemas.microsoft.com/office/word/2024/wordml/sdtformatlock" xmlns:w16se="http://schemas.microsoft.com/office/word/2015/wordml/symex" xmlns:wpg="http://schemas.microsoft.com/office/word/2010/wordprocessingGroup" xmlns:wpi="http://schemas.microsoft.com/office/word/2010/wordprocessingInk" xmlns:wne="http://schemas.microsoft.com/office/word/2006/wordml" xmlns:wps="http://schemas.microsoft.com/office/word/2010/wordprocessingShape" mc:Ignorable="w14 w15 w16se w16cid w16 w16cex w16sdtdh w16sdtfl w16du wp14">
   <w:sdt>
     <w:sdtPr>
       <w:id w:val="1791933869"/>
@@ -16697,7 +16756,7 @@
 </file>
 
 <file path=word/footer5.xml><?xml version="1.0" encoding="utf-8"?>
-<w:ftr xmlns:wpc="http://schemas.microsoft.com/office/word/2010/wordprocessingCanvas" xmlns:cx="http://schemas.microsoft.com/office/drawing/2014/chartex" xmlns:cx1="http://schemas.microsoft.com/office/drawing/2015/9/8/chartex" xmlns:cx2="http://schemas.microsoft.com/office/drawing/2015/10/21/chartex" xmlns:cx3="http://schemas.microsoft.com/office/drawing/2016/5/9/chartex" xmlns:cx4="http://schemas.microsoft.com/office/drawing/2016/5/10/chartex" xmlns:cx5="http://schemas.microsoft.com/office/drawing/2016/5/11/chartex" xmlns:cx6="http://schemas.microsoft.com/office/drawing/2016/5/12/chartex" xmlns:cx7="http://schemas.microsoft.com/office/drawing/2016/5/13/chartex" xmlns:cx8="http://schemas.microsoft.com/office/drawing/2016/5/14/chartex" xmlns:mc="http://schemas.openxmlformats.org/markup-compatibility/2006" xmlns:aink="http://schemas.microsoft.com/office/drawing/2016/ink" xmlns:am3d="http://schemas.microsoft.com/office/drawing/2017/model3d" xmlns:o="urn:schemas-microsoft-com:office:office" xmlns:oel="http://schemas.microsoft.com/office/2019/extlst" xmlns:r="http://schemas.openxmlformats.org/officeDocument/2006/relationships" xmlns:m="http://schemas.openxmlformats.org/officeDocument/2006/math" xmlns:v="urn:schemas-microsoft-com:vml" xmlns:wp14="http://schemas.microsoft.com/office/word/2010/wordprocessingDrawing" xmlns:wp="http://schemas.openxmlformats.org/drawingml/2006/wordprocessingDrawing" xmlns:w10="urn:schemas-microsoft-com:office:word" xmlns:w="http://schemas.openxmlformats.org/wordprocessingml/2006/main" xmlns:w14="http://schemas.microsoft.com/office/word/2010/wordml" xmlns:w15="http://schemas.microsoft.com/office/word/2012/wordml" xmlns:w16cex="http://schemas.microsoft.com/office/word/2018/wordml/cex" xmlns:w16cid="http://schemas.microsoft.com/office/word/2016/wordml/cid" xmlns:w16="http://schemas.microsoft.com/office/word/2018/wordml" xmlns:w16du="http://schemas.microsoft.com/office/word/2023/wordml/word16du" xmlns:w16sdtdh="http://schemas.microsoft.com/office/word/2020/wordml/sdtdatahash" xmlns:w16sdtfl="http://schemas.microsoft.com/office/word/2024/wordml/sdtformatlock" xmlns:w16se="http://schemas.microsoft.com/office/word/2015/wordml/symex" xmlns:wpg="http://schemas.microsoft.com/office/word/2010/wordprocessingGroup" xmlns:wpi="http://schemas.microsoft.com/office/word/2010/wordprocessingInk" xmlns:wne="http://schemas.microsoft.com/office/word/2006/wordml" xmlns:wps="http://schemas.microsoft.com/office/word/2010/wordprocessingShape" mc:Ignorable="w14 w15 w16se w16cid w16 w16cex w16sdtdh w16sdtfl w16du wp14">
+<w:ftr xmlns:wpc="http://schemas.microsoft.com/office/word/2010/wordprocessingCanvas" xmlns:cx="http://schemas.microsoft.com/office/drawing/2014/chartex" xmlns:cx1="http://schemas.microsoft.com/office/drawing/2015/9/8/chartex" xmlns:cx2="http://schemas.microsoft.com/office/drawing/2015/10/21/chartex" xmlns:cx3="http://schemas.microsoft.com/office/drawing/2016/5/9/chartex" xmlns:cx4="http://schemas.microsoft.com/office/drawing/2016/5/10/chartex" xmlns:cx5="http://schemas.microsoft.com/office/drawing/2016/5/11/chartex" xmlns:cx6="http://schemas.microsoft.com/office/drawing/2016/5/12/chartex" xmlns:cx7="http://schemas.microsoft.com/office/drawing/2016/5/13/chartex" xmlns:cx8="http://schemas.microsoft.com/office/drawing/2016/5/14/chartex" xmlns:mc="http://schemas.openxmlformats.org/markup-compatibility/2006" xmlns:aink="http://schemas.microsoft.com/office/drawing/2016/ink" xmlns:am3d="http://schemas.microsoft.com/office/drawing/2017/model3d" xmlns:o="urn:schemas-microsoft-com:office:office" xmlns:oel="http://schemas.microsoft.com/office/2019/extlst" xmlns:r="http://schemas.openxmlformats.org/officeDocument/2006/relationships" xmlns:m="http://schemas.openxmlformats.org/officeDocument/2006/math" xmlns:v="urn:schemas-microsoft-com:vml" xmlns:wp14="http://schemas.microsoft.com/office/word/2010/wordprocessingDrawing" xmlns:wp="http://schemas.openxmlformats.org/drawingml/2006/wordprocessingDrawing" xmlns:w10="urn:schemas-microsoft-com:office:word" xmlns:w="http://schemas.openxmlformats.org/wordprocessingml/2006/main" xmlns:w14="http://schemas.microsoft.com/office/word/2010/wordml" xmlns:w15="http://schemas.microsoft.com/office/word/2012/wordml" xmlns:w16cei="http://schemas.microsoft.com/office/word/2026/wordml/cei" xmlns:w16cex="http://schemas.microsoft.com/office/word/2018/wordml/cex" xmlns:w16cid="http://schemas.microsoft.com/office/word/2016/wordml/cid" xmlns:w16="http://schemas.microsoft.com/office/word/2018/wordml" xmlns:w16du="http://schemas.microsoft.com/office/word/2023/wordml/word16du" xmlns:w16sdtdh="http://schemas.microsoft.com/office/word/2020/wordml/sdtdatahash" xmlns:w16sdtfl="http://schemas.microsoft.com/office/word/2024/wordml/sdtformatlock" xmlns:w16se="http://schemas.microsoft.com/office/word/2015/wordml/symex" xmlns:wpg="http://schemas.microsoft.com/office/word/2010/wordprocessingGroup" xmlns:wpi="http://schemas.microsoft.com/office/word/2010/wordprocessingInk" xmlns:wne="http://schemas.microsoft.com/office/word/2006/wordml" xmlns:wps="http://schemas.microsoft.com/office/word/2010/wordprocessingShape" mc:Ignorable="w14 w15 w16se w16cid w16 w16cex w16sdtdh w16sdtfl w16du wp14">
   <w:sdt>
     <w:sdtPr>
       <w:id w:val="-620380050"/>
@@ -16742,7 +16801,7 @@
 </file>
 
 <file path=word/footer6.xml><?xml version="1.0" encoding="utf-8"?>
-<w:ftr xmlns:wpc="http://schemas.microsoft.com/office/word/2010/wordprocessingCanvas" xmlns:cx="http://schemas.microsoft.com/office/drawing/2014/chartex" xmlns:cx1="http://schemas.microsoft.com/office/drawing/2015/9/8/chartex" xmlns:cx2="http://schemas.microsoft.com/office/drawing/2015/10/21/chartex" xmlns:cx3="http://schemas.microsoft.com/office/drawing/2016/5/9/chartex" xmlns:cx4="http://schemas.microsoft.com/office/drawing/2016/5/10/chartex" xmlns:cx5="http://schemas.microsoft.com/office/drawing/2016/5/11/chartex" xmlns:cx6="http://schemas.microsoft.com/office/drawing/2016/5/12/chartex" xmlns:cx7="http://schemas.microsoft.com/office/drawing/2016/5/13/chartex" xmlns:cx8="http://schemas.microsoft.com/office/drawing/2016/5/14/chartex" xmlns:mc="http://schemas.openxmlformats.org/markup-compatibility/2006" xmlns:aink="http://schemas.microsoft.com/office/drawing/2016/ink" xmlns:am3d="http://schemas.microsoft.com/office/drawing/2017/model3d" xmlns:o="urn:schemas-microsoft-com:office:office" xmlns:oel="http://schemas.microsoft.com/office/2019/extlst" xmlns:r="http://schemas.openxmlformats.org/officeDocument/2006/relationships" xmlns:m="http://schemas.openxmlformats.org/officeDocument/2006/math" xmlns:v="urn:schemas-microsoft-com:vml" xmlns:wp14="http://schemas.microsoft.com/office/word/2010/wordprocessingDrawing" xmlns:wp="http://schemas.openxmlformats.org/drawingml/2006/wordprocessingDrawing" xmlns:w10="urn:schemas-microsoft-com:office:word" xmlns:w="http://schemas.openxmlformats.org/wordprocessingml/2006/main" xmlns:w14="http://schemas.microsoft.com/office/word/2010/wordml" xmlns:w15="http://schemas.microsoft.com/office/word/2012/wordml" xmlns:w16cex="http://schemas.microsoft.com/office/word/2018/wordml/cex" xmlns:w16cid="http://schemas.microsoft.com/office/word/2016/wordml/cid" xmlns:w16="http://schemas.microsoft.com/office/word/2018/wordml" xmlns:w16du="http://schemas.microsoft.com/office/word/2023/wordml/word16du" xmlns:w16sdtdh="http://schemas.microsoft.com/office/word/2020/wordml/sdtdatahash" xmlns:w16sdtfl="http://schemas.microsoft.com/office/word/2024/wordml/sdtformatlock" xmlns:w16se="http://schemas.microsoft.com/office/word/2015/wordml/symex" xmlns:wpg="http://schemas.microsoft.com/office/word/2010/wordprocessingGroup" xmlns:wpi="http://schemas.microsoft.com/office/word/2010/wordprocessingInk" xmlns:wne="http://schemas.microsoft.com/office/word/2006/wordml" xmlns:wps="http://schemas.microsoft.com/office/word/2010/wordprocessingShape" mc:Ignorable="w14 w15 w16se w16cid w16 w16cex w16sdtdh w16sdtfl w16du wp14">
+<w:ftr xmlns:wpc="http://schemas.microsoft.com/office/word/2010/wordprocessingCanvas" xmlns:cx="http://schemas.microsoft.com/office/drawing/2014/chartex" xmlns:cx1="http://schemas.microsoft.com/office/drawing/2015/9/8/chartex" xmlns:cx2="http://schemas.microsoft.com/office/drawing/2015/10/21/chartex" xmlns:cx3="http://schemas.microsoft.com/office/drawing/2016/5/9/chartex" xmlns:cx4="http://schemas.microsoft.com/office/drawing/2016/5/10/chartex" xmlns:cx5="http://schemas.microsoft.com/office/drawing/2016/5/11/chartex" xmlns:cx6="http://schemas.microsoft.com/office/drawing/2016/5/12/chartex" xmlns:cx7="http://schemas.microsoft.com/office/drawing/2016/5/13/chartex" xmlns:cx8="http://schemas.microsoft.com/office/drawing/2016/5/14/chartex" xmlns:mc="http://schemas.openxmlformats.org/markup-compatibility/2006" xmlns:aink="http://schemas.microsoft.com/office/drawing/2016/ink" xmlns:am3d="http://schemas.microsoft.com/office/drawing/2017/model3d" xmlns:o="urn:schemas-microsoft-com:office:office" xmlns:oel="http://schemas.microsoft.com/office/2019/extlst" xmlns:r="http://schemas.openxmlformats.org/officeDocument/2006/relationships" xmlns:m="http://schemas.openxmlformats.org/officeDocument/2006/math" xmlns:v="urn:schemas-microsoft-com:vml" xmlns:wp14="http://schemas.microsoft.com/office/word/2010/wordprocessingDrawing" xmlns:wp="http://schemas.openxmlformats.org/drawingml/2006/wordprocessingDrawing" xmlns:w10="urn:schemas-microsoft-com:office:word" xmlns:w="http://schemas.openxmlformats.org/wordprocessingml/2006/main" xmlns:w14="http://schemas.microsoft.com/office/word/2010/wordml" xmlns:w15="http://schemas.microsoft.com/office/word/2012/wordml" xmlns:w16cei="http://schemas.microsoft.com/office/word/2026/wordml/cei" xmlns:w16cex="http://schemas.microsoft.com/office/word/2018/wordml/cex" xmlns:w16cid="http://schemas.microsoft.com/office/word/2016/wordml/cid" xmlns:w16="http://schemas.microsoft.com/office/word/2018/wordml" xmlns:w16du="http://schemas.microsoft.com/office/word/2023/wordml/word16du" xmlns:w16sdtdh="http://schemas.microsoft.com/office/word/2020/wordml/sdtdatahash" xmlns:w16sdtfl="http://schemas.microsoft.com/office/word/2024/wordml/sdtformatlock" xmlns:w16se="http://schemas.microsoft.com/office/word/2015/wordml/symex" xmlns:wpg="http://schemas.microsoft.com/office/word/2010/wordprocessingGroup" xmlns:wpi="http://schemas.microsoft.com/office/word/2010/wordprocessingInk" xmlns:wne="http://schemas.microsoft.com/office/word/2006/wordml" xmlns:wps="http://schemas.microsoft.com/office/word/2010/wordprocessingShape" mc:Ignorable="w14 w15 w16se w16cid w16 w16cex w16sdtdh w16sdtfl w16du wp14">
   <w:p>
     <w:pPr>
       <w:pStyle w:val="Zpat"/>
@@ -16752,7 +16811,7 @@
 </file>
 
 <file path=word/footer7.xml><?xml version="1.0" encoding="utf-8"?>
-<w:ftr xmlns:wpc="http://schemas.microsoft.com/office/word/2010/wordprocessingCanvas" xmlns:cx="http://schemas.microsoft.com/office/drawing/2014/chartex" xmlns:cx1="http://schemas.microsoft.com/office/drawing/2015/9/8/chartex" xmlns:cx2="http://schemas.microsoft.com/office/drawing/2015/10/21/chartex" xmlns:cx3="http://schemas.microsoft.com/office/drawing/2016/5/9/chartex" xmlns:cx4="http://schemas.microsoft.com/office/drawing/2016/5/10/chartex" xmlns:cx5="http://schemas.microsoft.com/office/drawing/2016/5/11/chartex" xmlns:cx6="http://schemas.microsoft.com/office/drawing/2016/5/12/chartex" xmlns:cx7="http://schemas.microsoft.com/office/drawing/2016/5/13/chartex" xmlns:cx8="http://schemas.microsoft.com/office/drawing/2016/5/14/chartex" xmlns:mc="http://schemas.openxmlformats.org/markup-compatibility/2006" xmlns:aink="http://schemas.microsoft.com/office/drawing/2016/ink" xmlns:am3d="http://schemas.microsoft.com/office/drawing/2017/model3d" xmlns:o="urn:schemas-microsoft-com:office:office" xmlns:oel="http://schemas.microsoft.com/office/2019/extlst" xmlns:r="http://schemas.openxmlformats.org/officeDocument/2006/relationships" xmlns:m="http://schemas.openxmlformats.org/officeDocument/2006/math" xmlns:v="urn:schemas-microsoft-com:vml" xmlns:wp14="http://schemas.microsoft.com/office/word/2010/wordprocessingDrawing" xmlns:wp="http://schemas.openxmlformats.org/drawingml/2006/wordprocessingDrawing" xmlns:w10="urn:schemas-microsoft-com:office:word" xmlns:w="http://schemas.openxmlformats.org/wordprocessingml/2006/main" xmlns:w14="http://schemas.microsoft.com/office/word/2010/wordml" xmlns:w15="http://schemas.microsoft.com/office/word/2012/wordml" xmlns:w16cex="http://schemas.microsoft.com/office/word/2018/wordml/cex" xmlns:w16cid="http://schemas.microsoft.com/office/word/2016/wordml/cid" xmlns:w16="http://schemas.microsoft.com/office/word/2018/wordml" xmlns:w16du="http://schemas.microsoft.com/office/word/2023/wordml/word16du" xmlns:w16sdtdh="http://schemas.microsoft.com/office/word/2020/wordml/sdtdatahash" xmlns:w16sdtfl="http://schemas.microsoft.com/office/word/2024/wordml/sdtformatlock" xmlns:w16se="http://schemas.microsoft.com/office/word/2015/wordml/symex" xmlns:wpg="http://schemas.microsoft.com/office/word/2010/wordprocessingGroup" xmlns:wpi="http://schemas.microsoft.com/office/word/2010/wordprocessingInk" xmlns:wne="http://schemas.microsoft.com/office/word/2006/wordml" xmlns:wps="http://schemas.microsoft.com/office/word/2010/wordprocessingShape" mc:Ignorable="w14 w15 w16se w16cid w16 w16cex w16sdtdh w16sdtfl w16du wp14">
+<w:ftr xmlns:wpc="http://schemas.microsoft.com/office/word/2010/wordprocessingCanvas" xmlns:cx="http://schemas.microsoft.com/office/drawing/2014/chartex" xmlns:cx1="http://schemas.microsoft.com/office/drawing/2015/9/8/chartex" xmlns:cx2="http://schemas.microsoft.com/office/drawing/2015/10/21/chartex" xmlns:cx3="http://schemas.microsoft.com/office/drawing/2016/5/9/chartex" xmlns:cx4="http://schemas.microsoft.com/office/drawing/2016/5/10/chartex" xmlns:cx5="http://schemas.microsoft.com/office/drawing/2016/5/11/chartex" xmlns:cx6="http://schemas.microsoft.com/office/drawing/2016/5/12/chartex" xmlns:cx7="http://schemas.microsoft.com/office/drawing/2016/5/13/chartex" xmlns:cx8="http://schemas.microsoft.com/office/drawing/2016/5/14/chartex" xmlns:mc="http://schemas.openxmlformats.org/markup-compatibility/2006" xmlns:aink="http://schemas.microsoft.com/office/drawing/2016/ink" xmlns:am3d="http://schemas.microsoft.com/office/drawing/2017/model3d" xmlns:o="urn:schemas-microsoft-com:office:office" xmlns:oel="http://schemas.microsoft.com/office/2019/extlst" xmlns:r="http://schemas.openxmlformats.org/officeDocument/2006/relationships" xmlns:m="http://schemas.openxmlformats.org/officeDocument/2006/math" xmlns:v="urn:schemas-microsoft-com:vml" xmlns:wp14="http://schemas.microsoft.com/office/word/2010/wordprocessingDrawing" xmlns:wp="http://schemas.openxmlformats.org/drawingml/2006/wordprocessingDrawing" xmlns:w10="urn:schemas-microsoft-com:office:word" xmlns:w="http://schemas.openxmlformats.org/wordprocessingml/2006/main" xmlns:w14="http://schemas.microsoft.com/office/word/2010/wordml" xmlns:w15="http://schemas.microsoft.com/office/word/2012/wordml" xmlns:w16cei="http://schemas.microsoft.com/office/word/2026/wordml/cei" xmlns:w16cex="http://schemas.microsoft.com/office/word/2018/wordml/cex" xmlns:w16cid="http://schemas.microsoft.com/office/word/2016/wordml/cid" xmlns:w16="http://schemas.microsoft.com/office/word/2018/wordml" xmlns:w16du="http://schemas.microsoft.com/office/word/2023/wordml/word16du" xmlns:w16sdtdh="http://schemas.microsoft.com/office/word/2020/wordml/sdtdatahash" xmlns:w16sdtfl="http://schemas.microsoft.com/office/word/2024/wordml/sdtformatlock" xmlns:w16se="http://schemas.microsoft.com/office/word/2015/wordml/symex" xmlns:wpg="http://schemas.microsoft.com/office/word/2010/wordprocessingGroup" xmlns:wpi="http://schemas.microsoft.com/office/word/2010/wordprocessingInk" xmlns:wne="http://schemas.microsoft.com/office/word/2006/wordml" xmlns:wps="http://schemas.microsoft.com/office/word/2010/wordprocessingShape" mc:Ignorable="w14 w15 w16se w16cid w16 w16cex w16sdtdh w16sdtfl w16du wp14">
   <w:p>
     <w:pPr>
       <w:pStyle w:val="Zpat"/>
@@ -16762,7 +16821,7 @@
 </file>
 
 <file path=word/footnotes.xml><?xml version="1.0" encoding="utf-8"?>
-<w:footnotes xmlns:wpc="http://schemas.microsoft.com/office/word/2010/wordprocessingCanvas" xmlns:cx="http://schemas.microsoft.com/office/drawing/2014/chartex" xmlns:cx1="http://schemas.microsoft.com/office/drawing/2015/9/8/chartex" xmlns:cx2="http://schemas.microsoft.com/office/drawing/2015/10/21/chartex" xmlns:cx3="http://schemas.microsoft.com/office/drawing/2016/5/9/chartex" xmlns:cx4="http://schemas.microsoft.com/office/drawing/2016/5/10/chartex" xmlns:cx5="http://schemas.microsoft.com/office/drawing/2016/5/11/chartex" xmlns:cx6="http://schemas.microsoft.com/office/drawing/2016/5/12/chartex" xmlns:cx7="http://schemas.microsoft.com/office/drawing/2016/5/13/chartex" xmlns:cx8="http://schemas.microsoft.com/office/drawing/2016/5/14/chartex" xmlns:mc="http://schemas.openxmlformats.org/markup-compatibility/2006" xmlns:aink="http://schemas.microsoft.com/office/drawing/2016/ink" xmlns:am3d="http://schemas.microsoft.com/office/drawing/2017/model3d" xmlns:o="urn:schemas-microsoft-com:office:office" xmlns:oel="http://schemas.microsoft.com/office/2019/extlst" xmlns:r="http://schemas.openxmlformats.org/officeDocument/2006/relationships" xmlns:m="http://schemas.openxmlformats.org/officeDocument/2006/math" xmlns:v="urn:schemas-microsoft-com:vml" xmlns:wp14="http://schemas.microsoft.com/office/word/2010/wordprocessingDrawing" xmlns:wp="http://schemas.openxmlformats.org/drawingml/2006/wordprocessingDrawing" xmlns:w10="urn:schemas-microsoft-com:office:word" xmlns:w="http://schemas.openxmlformats.org/wordprocessingml/2006/main" xmlns:w14="http://schemas.microsoft.com/office/word/2010/wordml" xmlns:w15="http://schemas.microsoft.com/office/word/2012/wordml" xmlns:w16cex="http://schemas.microsoft.com/office/word/2018/wordml/cex" xmlns:w16cid="http://schemas.microsoft.com/office/word/2016/wordml/cid" xmlns:w16="http://schemas.microsoft.com/office/word/2018/wordml" xmlns:w16du="http://schemas.microsoft.com/office/word/2023/wordml/word16du" xmlns:w16sdtdh="http://schemas.microsoft.com/office/word/2020/wordml/sdtdatahash" xmlns:w16sdtfl="http://schemas.microsoft.com/office/word/2024/wordml/sdtformatlock" xmlns:w16se="http://schemas.microsoft.com/office/word/2015/wordml/symex" xmlns:wpg="http://schemas.microsoft.com/office/word/2010/wordprocessingGroup" xmlns:wpi="http://schemas.microsoft.com/office/word/2010/wordprocessingInk" xmlns:wne="http://schemas.microsoft.com/office/word/2006/wordml" xmlns:wps="http://schemas.microsoft.com/office/word/2010/wordprocessingShape" mc:Ignorable="w14 w15 w16se w16cid w16 w16cex w16sdtdh w16sdtfl w16du wp14">
+<w:footnotes xmlns:wpc="http://schemas.microsoft.com/office/word/2010/wordprocessingCanvas" xmlns:cx="http://schemas.microsoft.com/office/drawing/2014/chartex" xmlns:cx1="http://schemas.microsoft.com/office/drawing/2015/9/8/chartex" xmlns:cx2="http://schemas.microsoft.com/office/drawing/2015/10/21/chartex" xmlns:cx3="http://schemas.microsoft.com/office/drawing/2016/5/9/chartex" xmlns:cx4="http://schemas.microsoft.com/office/drawing/2016/5/10/chartex" xmlns:cx5="http://schemas.microsoft.com/office/drawing/2016/5/11/chartex" xmlns:cx6="http://schemas.microsoft.com/office/drawing/2016/5/12/chartex" xmlns:cx7="http://schemas.microsoft.com/office/drawing/2016/5/13/chartex" xmlns:cx8="http://schemas.microsoft.com/office/drawing/2016/5/14/chartex" xmlns:mc="http://schemas.openxmlformats.org/markup-compatibility/2006" xmlns:aink="http://schemas.microsoft.com/office/drawing/2016/ink" xmlns:am3d="http://schemas.microsoft.com/office/drawing/2017/model3d" xmlns:o="urn:schemas-microsoft-com:office:office" xmlns:oel="http://schemas.microsoft.com/office/2019/extlst" xmlns:r="http://schemas.openxmlformats.org/officeDocument/2006/relationships" xmlns:m="http://schemas.openxmlformats.org/officeDocument/2006/math" xmlns:v="urn:schemas-microsoft-com:vml" xmlns:wp14="http://schemas.microsoft.com/office/word/2010/wordprocessingDrawing" xmlns:wp="http://schemas.openxmlformats.org/drawingml/2006/wordprocessingDrawing" xmlns:w10="urn:schemas-microsoft-com:office:word" xmlns:w="http://schemas.openxmlformats.org/wordprocessingml/2006/main" xmlns:w14="http://schemas.microsoft.com/office/word/2010/wordml" xmlns:w15="http://schemas.microsoft.com/office/word/2012/wordml" xmlns:w16cei="http://schemas.microsoft.com/office/word/2026/wordml/cei" xmlns:w16cex="http://schemas.microsoft.com/office/word/2018/wordml/cex" xmlns:w16cid="http://schemas.microsoft.com/office/word/2016/wordml/cid" xmlns:w16="http://schemas.microsoft.com/office/word/2018/wordml" xmlns:w16du="http://schemas.microsoft.com/office/word/2023/wordml/word16du" xmlns:w16sdtdh="http://schemas.microsoft.com/office/word/2020/wordml/sdtdatahash" xmlns:w16sdtfl="http://schemas.microsoft.com/office/word/2024/wordml/sdtformatlock" xmlns:w16se="http://schemas.microsoft.com/office/word/2015/wordml/symex" xmlns:wpg="http://schemas.microsoft.com/office/word/2010/wordprocessingGroup" xmlns:wpi="http://schemas.microsoft.com/office/word/2010/wordprocessingInk" xmlns:wne="http://schemas.microsoft.com/office/word/2006/wordml" xmlns:wps="http://schemas.microsoft.com/office/word/2010/wordprocessingShape" mc:Ignorable="w14 w15 w16se w16cid w16 w16cex w16sdtdh w16sdtfl w16du wp14">
   <w:footnote w:type="separator" w:id="-1">
     <w:p>
       <w:pPr>
@@ -16787,7 +16846,7 @@
 </file>
 
 <file path=word/numbering.xml><?xml version="1.0" encoding="utf-8"?>
-<w:numbering xmlns:wpc="http://schemas.microsoft.com/office/word/2010/wordprocessingCanvas" xmlns:cx="http://schemas.microsoft.com/office/drawing/2014/chartex" xmlns:cx1="http://schemas.microsoft.com/office/drawing/2015/9/8/chartex" xmlns:cx2="http://schemas.microsoft.com/office/drawing/2015/10/21/chartex" xmlns:cx3="http://schemas.microsoft.com/office/drawing/2016/5/9/chartex" xmlns:cx4="http://schemas.microsoft.com/office/drawing/2016/5/10/chartex" xmlns:cx5="http://schemas.microsoft.com/office/drawing/2016/5/11/chartex" xmlns:cx6="http://schemas.microsoft.com/office/drawing/2016/5/12/chartex" xmlns:cx7="http://schemas.microsoft.com/office/drawing/2016/5/13/chartex" xmlns:cx8="http://schemas.microsoft.com/office/drawing/2016/5/14/chartex" xmlns:mc="http://schemas.openxmlformats.org/markup-compatibility/2006" xmlns:aink="http://schemas.microsoft.com/office/drawing/2016/ink" xmlns:am3d="http://schemas.microsoft.com/office/drawing/2017/model3d" xmlns:o="urn:schemas-microsoft-com:office:office" xmlns:oel="http://schemas.microsoft.com/office/2019/extlst" xmlns:r="http://schemas.openxmlformats.org/officeDocument/2006/relationships" xmlns:m="http://schemas.openxmlformats.org/officeDocument/2006/math" xmlns:v="urn:schemas-microsoft-com:vml" xmlns:wp14="http://schemas.microsoft.com/office/word/2010/wordprocessingDrawing" xmlns:wp="http://schemas.openxmlformats.org/drawingml/2006/wordprocessingDrawing" xmlns:w10="urn:schemas-microsoft-com:office:word" xmlns:w="http://schemas.openxmlformats.org/wordprocessingml/2006/main" xmlns:w14="http://schemas.microsoft.com/office/word/2010/wordml" xmlns:w15="http://schemas.microsoft.com/office/word/2012/wordml" xmlns:w16cex="http://schemas.microsoft.com/office/word/2018/wordml/cex" xmlns:w16cid="http://schemas.microsoft.com/office/word/2016/wordml/cid" xmlns:w16="http://schemas.microsoft.com/office/word/2018/wordml" xmlns:w16du="http://schemas.microsoft.com/office/word/2023/wordml/word16du" xmlns:w16sdtdh="http://schemas.microsoft.com/office/word/2020/wordml/sdtdatahash" xmlns:w16sdtfl="http://schemas.microsoft.com/office/word/2024/wordml/sdtformatlock" xmlns:w16se="http://schemas.microsoft.com/office/word/2015/wordml/symex" xmlns:wpg="http://schemas.microsoft.com/office/word/2010/wordprocessingGroup" xmlns:wpi="http://schemas.microsoft.com/office/word/2010/wordprocessingInk" xmlns:wne="http://schemas.microsoft.com/office/word/2006/wordml" xmlns:wps="http://schemas.microsoft.com/office/word/2010/wordprocessingShape" mc:Ignorable="w14 w15 w16se w16cid w16 w16cex w16sdtdh w16sdtfl w16du wp14">
+<w:numbering xmlns:wpc="http://schemas.microsoft.com/office/word/2010/wordprocessingCanvas" xmlns:cx="http://schemas.microsoft.com/office/drawing/2014/chartex" xmlns:cx1="http://schemas.microsoft.com/office/drawing/2015/9/8/chartex" xmlns:cx2="http://schemas.microsoft.com/office/drawing/2015/10/21/chartex" xmlns:cx3="http://schemas.microsoft.com/office/drawing/2016/5/9/chartex" xmlns:cx4="http://schemas.microsoft.com/office/drawing/2016/5/10/chartex" xmlns:cx5="http://schemas.microsoft.com/office/drawing/2016/5/11/chartex" xmlns:cx6="http://schemas.microsoft.com/office/drawing/2016/5/12/chartex" xmlns:cx7="http://schemas.microsoft.com/office/drawing/2016/5/13/chartex" xmlns:cx8="http://schemas.microsoft.com/office/drawing/2016/5/14/chartex" xmlns:mc="http://schemas.openxmlformats.org/markup-compatibility/2006" xmlns:aink="http://schemas.microsoft.com/office/drawing/2016/ink" xmlns:am3d="http://schemas.microsoft.com/office/drawing/2017/model3d" xmlns:o="urn:schemas-microsoft-com:office:office" xmlns:oel="http://schemas.microsoft.com/office/2019/extlst" xmlns:r="http://schemas.openxmlformats.org/officeDocument/2006/relationships" xmlns:m="http://schemas.openxmlformats.org/officeDocument/2006/math" xmlns:v="urn:schemas-microsoft-com:vml" xmlns:wp14="http://schemas.microsoft.com/office/word/2010/wordprocessingDrawing" xmlns:wp="http://schemas.openxmlformats.org/drawingml/2006/wordprocessingDrawing" xmlns:w10="urn:schemas-microsoft-com:office:word" xmlns:w="http://schemas.openxmlformats.org/wordprocessingml/2006/main" xmlns:w14="http://schemas.microsoft.com/office/word/2010/wordml" xmlns:w15="http://schemas.microsoft.com/office/word/2012/wordml" xmlns:w16cei="http://schemas.microsoft.com/office/word/2026/wordml/cei" xmlns:w16cex="http://schemas.microsoft.com/office/word/2018/wordml/cex" xmlns:w16cid="http://schemas.microsoft.com/office/word/2016/wordml/cid" xmlns:w16="http://schemas.microsoft.com/office/word/2018/wordml" xmlns:w16du="http://schemas.microsoft.com/office/word/2023/wordml/word16du" xmlns:w16sdtdh="http://schemas.microsoft.com/office/word/2020/wordml/sdtdatahash" xmlns:w16sdtfl="http://schemas.microsoft.com/office/word/2024/wordml/sdtformatlock" xmlns:w16se="http://schemas.microsoft.com/office/word/2015/wordml/symex" xmlns:wpg="http://schemas.microsoft.com/office/word/2010/wordprocessingGroup" xmlns:wpi="http://schemas.microsoft.com/office/word/2010/wordprocessingInk" xmlns:wne="http://schemas.microsoft.com/office/word/2006/wordml" xmlns:wps="http://schemas.microsoft.com/office/word/2010/wordprocessingShape" mc:Ignorable="w14 w15 w16se w16cid w16 w16cex w16sdtdh w16sdtfl w16du wp14">
   <w:numPicBullet w:numPicBulletId="0">
     <w:pict>
       <v:shapetype w14:anchorId="7A8947BC" id="_x0000_t75" coordsize="21600,21600" o:spt="75" o:preferrelative="t" path="m@4@5l@4@11@9@11@9@5xe" filled="f" stroked="f">

</xml_diff>